<commit_message>
TO-BE: convert _TOBE-BLUEPRINT.md sang .docx (đồng bộ mục 5.1.2 đã rút gọn)
Co-Authored-By: Claude Opus 4.8 (1M context) <noreply@anthropic.com>
</commit_message>
<xml_diff>
--- a/_TOBE-BLUEPRINT.docx
+++ b/_TOBE-BLUEPRINT.docx
@@ -17563,154 +17563,6 @@
           <w:i w:val="0"/>
           <w:sz w:val="24"/>
         </w:rPr>
-        <w:t>Cách tiếp cận — dùng số thứ tự lối đi có sẵn trên WMS:</w:t>
-      </w:r>
-      <w:r>
-        <w:rPr>
-          <w:rFonts w:ascii="Times New Roman" w:hAnsi="Times New Roman"/>
-          <w:b w:val="0"/>
-          <w:i w:val="0"/>
-          <w:sz w:val="24"/>
-        </w:rPr>
-        <w:t xml:space="preserve"> Mỗi vị trí đã được WMS gán một </w:t>
-      </w:r>
-      <w:r>
-        <w:rPr>
-          <w:rFonts w:ascii="Times New Roman" w:hAnsi="Times New Roman"/>
-          <w:b/>
-          <w:i w:val="0"/>
-          <w:sz w:val="24"/>
-        </w:rPr>
-        <w:t>số thứ tự lối đi</w:t>
-      </w:r>
-      <w:r>
-        <w:rPr>
-          <w:rFonts w:ascii="Times New Roman" w:hAnsi="Times New Roman"/>
-          <w:b w:val="0"/>
-          <w:i w:val="0"/>
-          <w:sz w:val="24"/>
-        </w:rPr>
-        <w:t xml:space="preserve"> (trường ORDER), đánh theo đúng đường nhân viên đi một vòng soạn hàng. </w:t>
-      </w:r>
-      <w:r>
-        <w:rPr>
-          <w:rFonts w:ascii="Times New Roman" w:hAnsi="Times New Roman"/>
-          <w:b/>
-          <w:i w:val="0"/>
-          <w:sz w:val="24"/>
-        </w:rPr>
-        <w:t>Chỉ cần sắp các dòng theo số này tăng dần là ra đúng trình tự đi soạn</w:t>
-      </w:r>
-      <w:r>
-        <w:rPr>
-          <w:rFonts w:ascii="Times New Roman" w:hAnsi="Times New Roman"/>
-          <w:b w:val="0"/>
-          <w:i w:val="0"/>
-          <w:sz w:val="24"/>
-        </w:rPr>
-        <w:t xml:space="preserve"> — liền mạch từ đầu đến cuối kho, không phải quay lại. Giải pháp </w:t>
-      </w:r>
-      <w:r>
-        <w:rPr>
-          <w:rFonts w:ascii="Times New Roman" w:hAnsi="Times New Roman"/>
-          <w:b/>
-          <w:i w:val="0"/>
-          <w:sz w:val="24"/>
-        </w:rPr>
-        <w:t>không dựng thêm tọa độ (x, y)</w:t>
-      </w:r>
-      <w:r>
-        <w:rPr>
-          <w:rFonts w:ascii="Times New Roman" w:hAnsi="Times New Roman"/>
-          <w:b w:val="0"/>
-          <w:i w:val="0"/>
-          <w:sz w:val="24"/>
-        </w:rPr>
-        <w:t xml:space="preserve"> vì khoảng cách thẳng không phản ánh đường đi vòng theo lối đi trong kho; mã vị trí dạng </w:t>
-      </w:r>
-      <w:r>
-        <w:rPr>
-          <w:rFonts w:ascii="Times New Roman" w:hAnsi="Times New Roman"/>
-          <w:b/>
-          <w:i w:val="0"/>
-          <w:sz w:val="24"/>
-        </w:rPr>
-        <w:t>Dãy.Bay.Tầng</w:t>
-      </w:r>
-      <w:r>
-        <w:rPr>
-          <w:rFonts w:ascii="Times New Roman" w:hAnsi="Times New Roman"/>
-          <w:b w:val="0"/>
-          <w:i w:val="0"/>
-          <w:sz w:val="24"/>
-        </w:rPr>
-        <w:t xml:space="preserve"> (ví dụ A17.13.2) cùng số thứ tự lối đi đã chứa đủ thông tin không gian.</w:t>
-      </w:r>
-    </w:p>
-    <w:p>
-      <w:r>
-        <w:rPr>
-          <w:rFonts w:ascii="Times New Roman" w:hAnsi="Times New Roman"/>
-          <w:b/>
-          <w:i w:val="0"/>
-          <w:sz w:val="24"/>
-        </w:rPr>
-        <w:t>Dữ liệu đã kiểm chứng (BKD1):</w:t>
-      </w:r>
-      <w:r>
-        <w:rPr>
-          <w:rFonts w:ascii="Times New Roman" w:hAnsi="Times New Roman"/>
-          <w:b w:val="0"/>
-          <w:i w:val="0"/>
-          <w:sz w:val="24"/>
-        </w:rPr>
-        <w:t xml:space="preserve"> ~52 dãy (A02–A52) và các khu đặc thù, tổng </w:t>
-      </w:r>
-      <w:r>
-        <w:rPr>
-          <w:rFonts w:ascii="Times New Roman" w:hAnsi="Times New Roman"/>
-          <w:b/>
-          <w:i w:val="0"/>
-          <w:sz w:val="24"/>
-        </w:rPr>
-        <w:t>3.027 vị trí</w:t>
-      </w:r>
-      <w:r>
-        <w:rPr>
-          <w:rFonts w:ascii="Times New Roman" w:hAnsi="Times New Roman"/>
-          <w:b w:val="0"/>
-          <w:i w:val="0"/>
-          <w:sz w:val="24"/>
-        </w:rPr>
-        <w:t xml:space="preserve">; số thứ tự lối đi chạy liên tục 1 → 3.026 (chỉ một vị trí rác cần loại), các dãy nối nhau đúng thứ tự và tăng đều trong từng dãy — </w:t>
-      </w:r>
-      <w:r>
-        <w:rPr>
-          <w:rFonts w:ascii="Times New Roman" w:hAnsi="Times New Roman"/>
-          <w:b/>
-          <w:i w:val="0"/>
-          <w:sz w:val="24"/>
-        </w:rPr>
-        <w:t>đủ tin cậy để dùng ngay</w:t>
-      </w:r>
-      <w:r>
-        <w:rPr>
-          <w:rFonts w:ascii="Times New Roman" w:hAnsi="Times New Roman"/>
-          <w:b w:val="0"/>
-          <w:i w:val="0"/>
-          <w:sz w:val="24"/>
-        </w:rPr>
-        <w:t>.</w:t>
-      </w:r>
-    </w:p>
-    <w:p>
-      <w:r>
-        <w:rPr>
-          <w:rFonts w:ascii="Times New Roman" w:hAnsi="Times New Roman"/>
-          <w:b/>
-          <w:i w:val="0"/>
-          <w:sz w:val="24"/>
-        </w:rPr>
         <w:t>Phương pháp xử lý (4 bước):</w:t>
       </w:r>
     </w:p>
@@ -17913,7 +17765,7 @@
           <w:i w:val="0"/>
           <w:sz w:val="24"/>
         </w:rPr>
-        <w:t>Bước 4 — Cắt đơn theo sức chứa.</w:t>
+        <w:t>Bước 4 — Cắt đơn theo giới hạn số pallet của đơn TO.</w:t>
       </w:r>
       <w:r>
         <w:rPr>
@@ -17922,7 +17774,7 @@
           <w:i w:val="0"/>
           <w:sz w:val="24"/>
         </w:rPr>
-        <w:t xml:space="preserve"> Duyệt danh sách đã sắp, dồn dòng vào một đơn đến khi chạm sức chứa thì chốt và mở đơn mới (do mục </w:t>
+        <w:t xml:space="preserve"> Duyệt danh sách đã sắp, dồn dòng vào một đơn đến tối đa 100 pallet thì chốt và mở đơn mới (do mục </w:t>
       </w:r>
       <w:r>
         <w:rPr>
@@ -17958,496 +17810,7 @@
           <w:i w:val="0"/>
           <w:sz w:val="24"/>
         </w:rPr>
-        <w:t>). Vì cắt trên danh sách đã sắp, mỗi đơn tự nhiên gom các vị trí liền kề, không cần tính đường thêm.</w:t>
-      </w:r>
-    </w:p>
-    <w:p>
-      <w:r>
-        <w:rPr>
-          <w:rFonts w:ascii="Times New Roman" w:hAnsi="Times New Roman"/>
-          <w:b/>
-          <w:i w:val="0"/>
-          <w:sz w:val="24"/>
-        </w:rPr>
-        <w:t>Sức chứa đơn theo khu (tham số cấu hình):</w:t>
-      </w:r>
-      <w:r>
-        <w:rPr>
-          <w:rFonts w:ascii="Times New Roman" w:hAnsi="Times New Roman"/>
-          <w:b w:val="0"/>
-          <w:i w:val="0"/>
-          <w:sz w:val="24"/>
-        </w:rPr>
-        <w:t xml:space="preserve"> Hai loại khu trong kho dùng thiết bị soạn khác nhau (xe nâng pallet vs giỏ nhặt lẻ), nên ngưỡng sức chứa mỗi đơn được khai riêng theo khu và cho vận hành tự chỉnh:</w:t>
-      </w:r>
-    </w:p>
-    <w:tbl>
-      <w:tblPr>
-        <w:tblStyle w:val="TableGrid"/>
-        <w:tblW w:type="auto" w:w="0"/>
-        <w:tblLook w:firstColumn="1" w:firstRow="1" w:lastColumn="0" w:lastRow="0" w:noHBand="0" w:noVBand="1" w:val="04A0"/>
-      </w:tblPr>
-      <w:tblGrid>
-        <w:gridCol w:w="3135"/>
-        <w:gridCol w:w="3135"/>
-        <w:gridCol w:w="3135"/>
-      </w:tblGrid>
-      <w:tr>
-        <w:tc>
-          <w:tcPr>
-            <w:tcW w:type="dxa" w:w="3135"/>
-            <w:shd w:val="clear" w:color="auto" w:fill="176BB4"/>
-          </w:tcPr>
-          <w:p>
-            <w:r/>
-            <w:r>
-              <w:rPr>
-                <w:rFonts w:ascii="Times New Roman" w:hAnsi="Times New Roman"/>
-                <w:b/>
-                <w:i w:val="0"/>
-                <w:color w:val="FFFFFF"/>
-                <w:sz w:val="24"/>
-              </w:rPr>
-              <w:t>Tham số</w:t>
-            </w:r>
-          </w:p>
-        </w:tc>
-        <w:tc>
-          <w:tcPr>
-            <w:tcW w:type="dxa" w:w="3135"/>
-            <w:shd w:val="clear" w:color="auto" w:fill="176BB4"/>
-          </w:tcPr>
-          <w:p>
-            <w:r/>
-            <w:r>
-              <w:rPr>
-                <w:rFonts w:ascii="Times New Roman" w:hAnsi="Times New Roman"/>
-                <w:b/>
-                <w:i w:val="0"/>
-                <w:color w:val="FFFFFF"/>
-                <w:sz w:val="24"/>
-              </w:rPr>
-              <w:t>Ý nghĩa</w:t>
-            </w:r>
-          </w:p>
-        </w:tc>
-        <w:tc>
-          <w:tcPr>
-            <w:tcW w:type="dxa" w:w="3135"/>
-            <w:shd w:val="clear" w:color="auto" w:fill="176BB4"/>
-          </w:tcPr>
-          <w:p>
-            <w:r/>
-            <w:r>
-              <w:rPr>
-                <w:rFonts w:ascii="Times New Roman" w:hAnsi="Times New Roman"/>
-                <w:b/>
-                <w:i w:val="0"/>
-                <w:color w:val="FFFFFF"/>
-                <w:sz w:val="24"/>
-              </w:rPr>
-              <w:t>Ghi chú</w:t>
-            </w:r>
-          </w:p>
-        </w:tc>
-      </w:tr>
-      <w:tr>
-        <w:tc>
-          <w:tcPr>
-            <w:tcW w:type="dxa" w:w="3135"/>
-          </w:tcPr>
-          <w:p>
-            <w:r/>
-            <w:r>
-              <w:rPr>
-                <w:rFonts w:ascii="Times New Roman" w:hAnsi="Times New Roman"/>
-                <w:b w:val="0"/>
-                <w:i w:val="0"/>
-                <w:sz w:val="24"/>
-              </w:rPr>
-              <w:t>Sức chứa đơn — khu hàng pallet/thùng chẵn</w:t>
-            </w:r>
-          </w:p>
-        </w:tc>
-        <w:tc>
-          <w:tcPr>
-            <w:tcW w:type="dxa" w:w="3135"/>
-          </w:tcPr>
-          <w:p>
-            <w:r/>
-            <w:r>
-              <w:rPr>
-                <w:rFonts w:ascii="Times New Roman" w:hAnsi="Times New Roman"/>
-                <w:b w:val="0"/>
-                <w:i w:val="0"/>
-                <w:sz w:val="24"/>
-              </w:rPr>
-              <w:t>Số lượng tối đa một đơn ở khu lấy nguyên pallet/thùng</w:t>
-            </w:r>
-          </w:p>
-        </w:tc>
-        <w:tc>
-          <w:tcPr>
-            <w:tcW w:type="dxa" w:w="3135"/>
-          </w:tcPr>
-          <w:p>
-            <w:r/>
-            <w:r>
-              <w:rPr>
-                <w:rFonts w:ascii="Times New Roman" w:hAnsi="Times New Roman"/>
-                <w:b w:val="0"/>
-                <w:i w:val="0"/>
-                <w:sz w:val="24"/>
-              </w:rPr>
-              <w:t>Soạn bằng xe nâng — tính theo số pallet hoặc thể tích</w:t>
-            </w:r>
-          </w:p>
-        </w:tc>
-      </w:tr>
-      <w:tr>
-        <w:tc>
-          <w:tcPr>
-            <w:tcW w:type="dxa" w:w="3135"/>
-          </w:tcPr>
-          <w:p>
-            <w:r/>
-            <w:r>
-              <w:rPr>
-                <w:rFonts w:ascii="Times New Roman" w:hAnsi="Times New Roman"/>
-                <w:b w:val="0"/>
-                <w:i w:val="0"/>
-                <w:sz w:val="24"/>
-              </w:rPr>
-              <w:t>Sức chứa đơn — khu nhặt lẻ</w:t>
-            </w:r>
-          </w:p>
-        </w:tc>
-        <w:tc>
-          <w:tcPr>
-            <w:tcW w:type="dxa" w:w="3135"/>
-          </w:tcPr>
-          <w:p>
-            <w:r/>
-            <w:r>
-              <w:rPr>
-                <w:rFonts w:ascii="Times New Roman" w:hAnsi="Times New Roman"/>
-                <w:b w:val="0"/>
-                <w:i w:val="0"/>
-                <w:sz w:val="24"/>
-              </w:rPr>
-              <w:t>Số lượng tối đa một đơn ở khu lấy lẻ</w:t>
-            </w:r>
-          </w:p>
-        </w:tc>
-        <w:tc>
-          <w:tcPr>
-            <w:tcW w:type="dxa" w:w="3135"/>
-          </w:tcPr>
-          <w:p>
-            <w:r/>
-            <w:r>
-              <w:rPr>
-                <w:rFonts w:ascii="Times New Roman" w:hAnsi="Times New Roman"/>
-                <w:b w:val="0"/>
-                <w:i w:val="0"/>
-                <w:sz w:val="24"/>
-              </w:rPr>
-              <w:t>Soạn bằng giỏ — tính theo số dòng hoặc khối lượng</w:t>
-            </w:r>
-          </w:p>
-        </w:tc>
-      </w:tr>
-      <w:tr>
-        <w:tc>
-          <w:tcPr>
-            <w:tcW w:type="dxa" w:w="3135"/>
-          </w:tcPr>
-          <w:p>
-            <w:r/>
-            <w:r>
-              <w:rPr>
-                <w:rFonts w:ascii="Times New Roman" w:hAnsi="Times New Roman"/>
-                <w:b w:val="0"/>
-                <w:i w:val="0"/>
-                <w:sz w:val="24"/>
-              </w:rPr>
-              <w:t>Đơn vị tính sức chứa</w:t>
-            </w:r>
-          </w:p>
-        </w:tc>
-        <w:tc>
-          <w:tcPr>
-            <w:tcW w:type="dxa" w:w="3135"/>
-          </w:tcPr>
-          <w:p>
-            <w:r/>
-            <w:r>
-              <w:rPr>
-                <w:rFonts w:ascii="Times New Roman" w:hAnsi="Times New Roman"/>
-                <w:b w:val="0"/>
-                <w:i w:val="0"/>
-                <w:sz w:val="24"/>
-              </w:rPr>
-              <w:t>Chọn tiêu chí cắt đơn: số dòng / thể tích / khối lượng</w:t>
-            </w:r>
-          </w:p>
-        </w:tc>
-        <w:tc>
-          <w:tcPr>
-            <w:tcW w:type="dxa" w:w="3135"/>
-          </w:tcPr>
-          <w:p>
-            <w:r/>
-            <w:r>
-              <w:rPr>
-                <w:rFonts w:ascii="Times New Roman" w:hAnsi="Times New Roman"/>
-                <w:b w:val="0"/>
-                <w:i w:val="0"/>
-                <w:sz w:val="24"/>
-              </w:rPr>
-              <w:t>Vận hành chọn theo thiết bị thực tế</w:t>
-            </w:r>
-          </w:p>
-        </w:tc>
-      </w:tr>
-    </w:tbl>
-    <w:p>
-      <w:r>
-        <w:rPr>
-          <w:rFonts w:ascii="Times New Roman" w:hAnsi="Times New Roman"/>
-          <w:b w:val="0"/>
-          <w:i w:val="0"/>
-          <w:sz w:val="24"/>
-        </w:rPr>
-        <w:t xml:space="preserve">Các tham số này </w:t>
-      </w:r>
-      <w:r>
-        <w:rPr>
-          <w:rFonts w:ascii="Times New Roman" w:hAnsi="Times New Roman"/>
-          <w:b/>
-          <w:i w:val="0"/>
-          <w:sz w:val="24"/>
-        </w:rPr>
-        <w:t>bổ sung cho</w:t>
-      </w:r>
-      <w:r>
-        <w:rPr>
-          <w:rFonts w:ascii="Times New Roman" w:hAnsi="Times New Roman"/>
-          <w:b w:val="0"/>
-          <w:i w:val="0"/>
-          <w:sz w:val="24"/>
-        </w:rPr>
-        <w:t xml:space="preserve"> ngưỡng pallet mỗi đơn ở mục </w:t>
-      </w:r>
-      <w:r>
-        <w:rPr>
-          <w:rFonts w:ascii="Times New Roman" w:hAnsi="Times New Roman"/>
-          <w:b/>
-          <w:i w:val="0"/>
-          <w:sz w:val="24"/>
-        </w:rPr>
-        <w:t>2.3</w:t>
-      </w:r>
-      <w:r>
-        <w:rPr>
-          <w:rFonts w:ascii="Times New Roman" w:hAnsi="Times New Roman"/>
-          <w:b w:val="0"/>
-          <w:i w:val="0"/>
-          <w:sz w:val="24"/>
-        </w:rPr>
-        <w:t xml:space="preserve"> — một đơn vừa không vượt ngưỡng pallet (ràng buộc cập nhật tồn lên SAP) vừa không vượt sức chứa thiết bị của khu.</w:t>
-      </w:r>
-    </w:p>
-    <w:p>
-      <w:r>
-        <w:rPr>
-          <w:rFonts w:ascii="Times New Roman" w:hAnsi="Times New Roman"/>
-          <w:b/>
-          <w:i w:val="0"/>
-          <w:sz w:val="24"/>
-        </w:rPr>
-        <w:t>Phạm vi áp dụng &amp; làm sạch dữ liệu:</w:t>
-      </w:r>
-    </w:p>
-    <w:p>
-      <w:pPr>
-        <w:pStyle w:val="ListBullet"/>
-      </w:pPr>
-      <w:r>
-        <w:rPr>
-          <w:rFonts w:ascii="Times New Roman" w:hAnsi="Times New Roman"/>
-          <w:b w:val="0"/>
-          <w:i w:val="0"/>
-          <w:sz w:val="24"/>
-        </w:rPr>
-        <w:t>Loại các vị trí không lấy được (đang kiểm kê, đang khóa, vị trí rác) trước khi sắp.</w:t>
-      </w:r>
-    </w:p>
-    <w:p>
-      <w:pPr>
-        <w:pStyle w:val="ListBullet"/>
-      </w:pPr>
-      <w:r>
-        <w:rPr>
-          <w:rFonts w:ascii="Times New Roman" w:hAnsi="Times New Roman"/>
-          <w:b w:val="0"/>
-          <w:i w:val="0"/>
-          <w:sz w:val="24"/>
-        </w:rPr>
-        <w:t xml:space="preserve">Chỉ áp cho kho nguồn </w:t>
-      </w:r>
-      <w:r>
-        <w:rPr>
-          <w:rFonts w:ascii="Times New Roman" w:hAnsi="Times New Roman"/>
-          <w:b/>
-          <w:i w:val="0"/>
-          <w:sz w:val="24"/>
-        </w:rPr>
-        <w:t>đã có số thứ tự lối đi</w:t>
-      </w:r>
-      <w:r>
-        <w:rPr>
-          <w:rFonts w:ascii="Times New Roman" w:hAnsi="Times New Roman"/>
-          <w:b w:val="0"/>
-          <w:i w:val="0"/>
-          <w:sz w:val="24"/>
-        </w:rPr>
-        <w:t xml:space="preserve"> (hiện đã kiểm chứng cho BKD1); kho chưa có → </w:t>
-      </w:r>
-      <w:r>
-        <w:rPr>
-          <w:rFonts w:ascii="Times New Roman" w:hAnsi="Times New Roman"/>
-          <w:b/>
-          <w:i w:val="0"/>
-          <w:sz w:val="24"/>
-        </w:rPr>
-        <w:t>bỏ qua bước gom</w:t>
-      </w:r>
-      <w:r>
-        <w:rPr>
-          <w:rFonts w:ascii="Times New Roman" w:hAnsi="Times New Roman"/>
-          <w:b w:val="0"/>
-          <w:i w:val="0"/>
-          <w:sz w:val="24"/>
-        </w:rPr>
-        <w:t xml:space="preserve">, tạo đơn theo cơ chế nền ở mục </w:t>
-      </w:r>
-      <w:r>
-        <w:rPr>
-          <w:rFonts w:ascii="Times New Roman" w:hAnsi="Times New Roman"/>
-          <w:b/>
-          <w:i w:val="0"/>
-          <w:sz w:val="24"/>
-        </w:rPr>
-        <w:t>5.1.1</w:t>
-      </w:r>
-      <w:r>
-        <w:rPr>
-          <w:rFonts w:ascii="Times New Roman" w:hAnsi="Times New Roman"/>
-          <w:b w:val="0"/>
-          <w:i w:val="0"/>
-          <w:sz w:val="24"/>
-        </w:rPr>
-        <w:t>.</w:t>
-      </w:r>
-    </w:p>
-    <w:p>
-      <w:r>
-        <w:rPr>
-          <w:rFonts w:ascii="Times New Roman" w:hAnsi="Times New Roman"/>
-          <w:b/>
-          <w:i w:val="0"/>
-          <w:sz w:val="24"/>
-        </w:rPr>
-        <w:t>Lưu ý &amp; lộ trình nâng cấp (về sau):</w:t>
-      </w:r>
-    </w:p>
-    <w:p>
-      <w:pPr>
-        <w:pStyle w:val="ListBullet"/>
-      </w:pPr>
-      <w:r>
-        <w:rPr>
-          <w:rFonts w:ascii="Times New Roman" w:hAnsi="Times New Roman"/>
-          <w:b/>
-          <w:i w:val="0"/>
-          <w:sz w:val="24"/>
-        </w:rPr>
-        <w:t>Chiều đi trong mỗi dãy:</w:t>
-      </w:r>
-      <w:r>
-        <w:rPr>
-          <w:rFonts w:ascii="Times New Roman" w:hAnsi="Times New Roman"/>
-          <w:b w:val="0"/>
-          <w:i w:val="0"/>
-          <w:sz w:val="24"/>
-        </w:rPr>
-        <w:t xml:space="preserve"> số thứ tự hiện đánh theo kiểu đi một chiều mỗi dãy; nếu dãy thông cả hai đầu thì còn dư địa rút ngắn đường. Điểm này </w:t>
-      </w:r>
-      <w:r>
-        <w:rPr>
-          <w:rFonts w:ascii="Times New Roman" w:hAnsi="Times New Roman"/>
-          <w:b/>
-          <w:i w:val="0"/>
-          <w:sz w:val="24"/>
-        </w:rPr>
-        <w:t>không ảnh hưởng việc gom SKU</w:t>
-      </w:r>
-      <w:r>
-        <w:rPr>
-          <w:rFonts w:ascii="Times New Roman" w:hAnsi="Times New Roman"/>
-          <w:b w:val="0"/>
-          <w:i w:val="0"/>
-          <w:sz w:val="24"/>
-        </w:rPr>
-        <w:t>, cần xác nhận với đội kho.</w:t>
-      </w:r>
-    </w:p>
-    <w:p>
-      <w:pPr>
-        <w:pStyle w:val="ListBullet"/>
-      </w:pPr>
-      <w:r>
-        <w:rPr>
-          <w:rFonts w:ascii="Times New Roman" w:hAnsi="Times New Roman"/>
-          <w:b/>
-          <w:i w:val="0"/>
-          <w:sz w:val="24"/>
-        </w:rPr>
-        <w:t>Hướng nâng cấp (để ngỏ):</w:t>
-      </w:r>
-      <w:r>
-        <w:rPr>
-          <w:rFonts w:ascii="Times New Roman" w:hAnsi="Times New Roman"/>
-          <w:b w:val="0"/>
-          <w:i w:val="0"/>
-          <w:sz w:val="24"/>
-        </w:rPr>
-        <w:t xml:space="preserve"> ưu tiên gom các vị trí cùng dãy trước (ước rút thêm ~20–30% quãng đường), hoặc dùng thuật toán tối ưu nâng cao khi quy mô rất lớn / dùng xe soạn tự động. Chi tiết xem báo cáo nghiên cứu kèm theo.</w:t>
-      </w:r>
-    </w:p>
-    <w:p/>
-    <w:p>
-      <w:r>
-        <w:rPr>
-          <w:rFonts w:ascii="Times New Roman" w:hAnsi="Times New Roman"/>
-          <w:b w:val="0"/>
-          <w:i/>
-          <w:color w:val="808080"/>
-          <w:sz w:val="24"/>
-        </w:rPr>
-        <w:t>[Ảnh màn hình: _[[MH-5.2: Màn hình dòng soạn theo lộ trình &amp; vị trí lấy hàng của đơn]]_ — chèn screenshot thật theo ID]</w:t>
-      </w:r>
-    </w:p>
-    <w:p>
-      <w:r>
-        <w:rPr>
-          <w:rFonts w:ascii="Times New Roman" w:hAnsi="Times New Roman"/>
-          <w:b w:val="0"/>
-          <w:i w:val="0"/>
-          <w:sz w:val="24"/>
-        </w:rPr>
-        <w:t>_[Chèn ảnh: danh sách dòng soạn của đơn sắp theo lối đi (mã vị trí Dãy.Bay.Tầng, SKU, lô, số pallet, vị trí lấy đã chọn), nhóm theo dãy; chỉ báo sức chứa đơn theo khu]_</w:t>
+        <w:t>).</w:t>
       </w:r>
     </w:p>
     <w:p>

</xml_diff>